<commit_message>
Iran War data set
Description of Iran war data set
</commit_message>
<xml_diff>
--- a/IRAN war dataset.docx
+++ b/IRAN war dataset.docx
@@ -25,6 +25,67 @@
     <w:p>
       <w:pPr>
         <w:rPr>
+          <w:sz w:val="36"/>
+          <w:szCs w:val="36"/>
+        </w:rPr>
+      </w:pPr>
+      <w:r>
+        <w:rPr>
+          <w:sz w:val="36"/>
+          <w:szCs w:val="36"/>
+        </w:rPr>
+        <w:t>Problem statement:</w:t>
+      </w:r>
+    </w:p>
+    <w:p>
+      <w:r>
+        <w:t xml:space="preserve"> </w:t>
+      </w:r>
+      <w:r>
+        <w:t xml:space="preserve">This dataset captures the </w:t>
+      </w:r>
+      <w:r>
+        <w:rPr>
+          <w:b/>
+          <w:bCs/>
+        </w:rPr>
+        <w:t>daily sales and price fluctuations of oil</w:t>
+      </w:r>
+      <w:r>
+        <w:t xml:space="preserve"> during the period </w:t>
+      </w:r>
+      <w:r>
+        <w:rPr>
+          <w:b/>
+          <w:bCs/>
+        </w:rPr>
+        <w:t>February 2026 to March 16, 2026</w:t>
+      </w:r>
+      <w:r>
+        <w:t xml:space="preserve">, a timeframe significantly impacted by geopolitical tensions related to the </w:t>
+      </w:r>
+      <w:r>
+        <w:rPr>
+          <w:b/>
+          <w:bCs/>
+        </w:rPr>
+        <w:t>Iran–US conflict</w:t>
+      </w:r>
+      <w:r>
+        <w:t>. The dataset is designed to support analysis and forecasting of oil price movements and their effect on sales across different countries.</w:t>
+      </w:r>
+    </w:p>
+    <w:p>
+      <w:r>
+        <w:t xml:space="preserve"> The current business problem is to predict the sales prices for different county tries based on the barrel affected prices in Iran war and shortage of the oil tankers to be passes</w:t>
+      </w:r>
+      <w:r>
+        <w:t>.</w:t>
+      </w:r>
+    </w:p>
+    <w:p>
+      <w:pPr>
+        <w:rPr>
           <w:sz w:val="32"/>
           <w:szCs w:val="32"/>
         </w:rPr>
@@ -34,140 +95,895 @@
           <w:sz w:val="32"/>
           <w:szCs w:val="32"/>
         </w:rPr>
-        <w:t xml:space="preserve">Problem </w:t>
-      </w:r>
-      <w:r>
-        <w:rPr>
-          <w:sz w:val="32"/>
-          <w:szCs w:val="32"/>
-        </w:rPr>
-        <w:t>statement:</w:t>
-      </w:r>
-    </w:p>
-    <w:p>
-      <w:r>
-        <w:t xml:space="preserve"> This dataset analysis the daily sales of oil prices impacted due to us-ran war as of </w:t>
-      </w:r>
-      <w:proofErr w:type="spellStart"/>
-      <w:r>
-        <w:t>feb</w:t>
-      </w:r>
-      <w:proofErr w:type="spellEnd"/>
-      <w:r>
-        <w:t xml:space="preserve"> 20206 to march 16 2026</w:t>
-      </w:r>
-      <w:r>
-        <w:t>.</w:t>
-      </w:r>
-    </w:p>
-    <w:p>
-      <w:r>
-        <w:t xml:space="preserve"> The current business problem is to predict the sales prices for different </w:t>
-      </w:r>
-      <w:r>
-        <w:t>county</w:t>
-      </w:r>
-      <w:r>
-        <w:t xml:space="preserve"> tries based on the barrel affected prices in </w:t>
-      </w:r>
-      <w:r>
-        <w:t>Iran</w:t>
-      </w:r>
-      <w:r>
-        <w:t xml:space="preserve"> war and shortage of the oil tankers to be </w:t>
-      </w:r>
-      <w:r>
-        <w:t>passes</w:t>
-      </w:r>
-      <w:r>
-        <w:t>.</w:t>
-      </w:r>
-    </w:p>
-    <w:p>
-      <w:r>
-        <w:t xml:space="preserve"> --- Data understanding and </w:t>
-      </w:r>
-      <w:r>
-        <w:t>preprocessing</w:t>
-      </w:r>
-      <w:r>
-        <w:t>:</w:t>
-      </w:r>
-    </w:p>
-    <w:p>
-      <w:pPr>
-        <w:pStyle w:val="ListParagraph"/>
+        <w:t xml:space="preserve"> --- Data understanding and preprocessing:</w:t>
+      </w:r>
+    </w:p>
+    <w:p>
+      <w:pPr>
+        <w:spacing w:after="0" w:line="240" w:lineRule="auto"/>
+        <w:rPr>
+          <w:rFonts w:ascii="Times New Roman" w:eastAsia="Times New Roman" w:hAnsi="Times New Roman" w:cs="Times New Roman"/>
+          <w:kern w:val="0"/>
+          <w:lang w:eastAsia="en-IN"/>
+          <w14:ligatures w14:val="none"/>
+        </w:rPr>
+      </w:pPr>
+      <w:r>
+        <w:rPr>
+          <w:rFonts w:ascii="Times New Roman" w:eastAsia="Times New Roman" w:hAnsi="Symbol" w:cs="Times New Roman"/>
+          <w:kern w:val="0"/>
+          <w:lang w:eastAsia="en-IN"/>
+          <w14:ligatures w14:val="none"/>
+        </w:rPr>
+        <w:t></w:t>
+      </w:r>
+      <w:r>
+        <w:rPr>
+          <w:rFonts w:ascii="Times New Roman" w:eastAsia="Times New Roman" w:hAnsi="Times New Roman" w:cs="Times New Roman"/>
+          <w:kern w:val="0"/>
+          <w:lang w:eastAsia="en-IN"/>
+          <w14:ligatures w14:val="none"/>
+        </w:rPr>
+        <w:t xml:space="preserve"> The</w:t>
+      </w:r>
+      <w:r>
+        <w:rPr>
+          <w:rFonts w:ascii="Times New Roman" w:eastAsia="Times New Roman" w:hAnsi="Times New Roman" w:cs="Times New Roman"/>
+          <w:kern w:val="0"/>
+          <w:lang w:eastAsia="en-IN"/>
+          <w14:ligatures w14:val="none"/>
+        </w:rPr>
+        <w:t xml:space="preserve"> dataset consists of </w:t>
+      </w:r>
+      <w:r>
+        <w:rPr>
+          <w:rFonts w:ascii="Times New Roman" w:eastAsia="Times New Roman" w:hAnsi="Times New Roman" w:cs="Times New Roman"/>
+          <w:b/>
+          <w:bCs/>
+          <w:i/>
+          <w:iCs/>
+          <w:kern w:val="0"/>
+          <w:lang w:eastAsia="en-IN"/>
+          <w14:ligatures w14:val="none"/>
+        </w:rPr>
+        <w:t>X columns</w:t>
+      </w:r>
+      <w:r>
+        <w:rPr>
+          <w:rFonts w:ascii="Times New Roman" w:eastAsia="Times New Roman" w:hAnsi="Times New Roman" w:cs="Times New Roman"/>
+          <w:kern w:val="0"/>
+          <w:lang w:eastAsia="en-IN"/>
+          <w14:ligatures w14:val="none"/>
+        </w:rPr>
+        <w:t xml:space="preserve"> and </w:t>
+      </w:r>
+      <w:r>
+        <w:rPr>
+          <w:rFonts w:ascii="Times New Roman" w:eastAsia="Times New Roman" w:hAnsi="Times New Roman" w:cs="Times New Roman"/>
+          <w:b/>
+          <w:bCs/>
+          <w:i/>
+          <w:iCs/>
+          <w:kern w:val="0"/>
+          <w:lang w:eastAsia="en-IN"/>
+          <w14:ligatures w14:val="none"/>
+        </w:rPr>
+        <w:t>Y records</w:t>
+      </w:r>
+      <w:r>
+        <w:rPr>
+          <w:rFonts w:ascii="Times New Roman" w:eastAsia="Times New Roman" w:hAnsi="Times New Roman" w:cs="Times New Roman"/>
+          <w:kern w:val="0"/>
+          <w:lang w:eastAsia="en-IN"/>
+          <w14:ligatures w14:val="none"/>
+        </w:rPr>
+        <w:t xml:space="preserve"> (update with actual numbers). </w:t>
+      </w:r>
+    </w:p>
+    <w:p>
+      <w:pPr>
+        <w:spacing w:after="0" w:line="240" w:lineRule="auto"/>
+        <w:rPr>
+          <w:rFonts w:ascii="Times New Roman" w:eastAsia="Times New Roman" w:hAnsi="Times New Roman" w:cs="Times New Roman"/>
+          <w:kern w:val="0"/>
+          <w:lang w:eastAsia="en-IN"/>
+          <w14:ligatures w14:val="none"/>
+        </w:rPr>
+      </w:pPr>
+      <w:r>
+        <w:rPr>
+          <w:rFonts w:ascii="Times New Roman" w:eastAsia="Times New Roman" w:hAnsi="Symbol" w:cs="Times New Roman"/>
+          <w:kern w:val="0"/>
+          <w:lang w:eastAsia="en-IN"/>
+          <w14:ligatures w14:val="none"/>
+        </w:rPr>
+        <w:t></w:t>
+      </w:r>
+      <w:r>
+        <w:rPr>
+          <w:rFonts w:ascii="Times New Roman" w:eastAsia="Times New Roman" w:hAnsi="Times New Roman" w:cs="Times New Roman"/>
+          <w:kern w:val="0"/>
+          <w:lang w:eastAsia="en-IN"/>
+          <w14:ligatures w14:val="none"/>
+        </w:rPr>
+        <w:t xml:space="preserve"> Each record represents </w:t>
+      </w:r>
+      <w:r>
+        <w:rPr>
+          <w:rFonts w:ascii="Times New Roman" w:eastAsia="Times New Roman" w:hAnsi="Times New Roman" w:cs="Times New Roman"/>
+          <w:b/>
+          <w:bCs/>
+          <w:kern w:val="0"/>
+          <w:lang w:eastAsia="en-IN"/>
+          <w14:ligatures w14:val="none"/>
+        </w:rPr>
+        <w:t>daily observations</w:t>
+      </w:r>
+      <w:r>
+        <w:rPr>
+          <w:rFonts w:ascii="Times New Roman" w:eastAsia="Times New Roman" w:hAnsi="Times New Roman" w:cs="Times New Roman"/>
+          <w:kern w:val="0"/>
+          <w:lang w:eastAsia="en-IN"/>
+          <w14:ligatures w14:val="none"/>
+        </w:rPr>
+        <w:t xml:space="preserve"> of oil prices and sales metrics. </w:t>
+      </w:r>
+    </w:p>
+    <w:p>
+      <w:pPr>
+        <w:spacing w:after="0" w:line="240" w:lineRule="auto"/>
+        <w:rPr>
+          <w:rFonts w:ascii="Times New Roman" w:eastAsia="Times New Roman" w:hAnsi="Times New Roman" w:cs="Times New Roman"/>
+          <w:kern w:val="0"/>
+          <w:lang w:eastAsia="en-IN"/>
+          <w14:ligatures w14:val="none"/>
+        </w:rPr>
+      </w:pPr>
+      <w:r>
+        <w:rPr>
+          <w:rFonts w:ascii="Times New Roman" w:eastAsia="Times New Roman" w:hAnsi="Symbol" w:cs="Times New Roman"/>
+          <w:kern w:val="0"/>
+          <w:lang w:eastAsia="en-IN"/>
+          <w14:ligatures w14:val="none"/>
+        </w:rPr>
+        <w:t></w:t>
+      </w:r>
+      <w:r>
+        <w:rPr>
+          <w:rFonts w:ascii="Times New Roman" w:eastAsia="Times New Roman" w:hAnsi="Times New Roman" w:cs="Times New Roman"/>
+          <w:kern w:val="0"/>
+          <w:lang w:eastAsia="en-IN"/>
+          <w14:ligatures w14:val="none"/>
+        </w:rPr>
+        <w:t xml:space="preserve"> The data reflects market disruptions caused by: </w:t>
+      </w:r>
+    </w:p>
+    <w:p>
+      <w:pPr>
         <w:numPr>
           <w:ilvl w:val="0"/>
           <w:numId w:val="1"/>
         </w:numPr>
-      </w:pPr>
-      <w:r>
-        <w:t xml:space="preserve">This data is about </w:t>
-      </w:r>
-      <w:r>
-        <w:t>Iran</w:t>
-      </w:r>
-      <w:r>
-        <w:t xml:space="preserve"> war data consist of x </w:t>
-      </w:r>
-      <w:r>
-        <w:t>columns</w:t>
-      </w:r>
-      <w:r>
-        <w:t xml:space="preserve"> and y records </w:t>
-      </w:r>
-    </w:p>
-    <w:p>
-      <w:pPr>
-        <w:pStyle w:val="ListParagraph"/>
+        <w:spacing w:before="100" w:beforeAutospacing="1" w:after="100" w:afterAutospacing="1" w:line="240" w:lineRule="auto"/>
+        <w:rPr>
+          <w:rFonts w:ascii="Times New Roman" w:eastAsia="Times New Roman" w:hAnsi="Times New Roman" w:cs="Times New Roman"/>
+          <w:kern w:val="0"/>
+          <w:lang w:eastAsia="en-IN"/>
+          <w14:ligatures w14:val="none"/>
+        </w:rPr>
+      </w:pPr>
+      <w:r>
+        <w:rPr>
+          <w:rFonts w:ascii="Times New Roman" w:eastAsia="Times New Roman" w:hAnsi="Times New Roman" w:cs="Times New Roman"/>
+          <w:kern w:val="0"/>
+          <w:lang w:eastAsia="en-IN"/>
+          <w14:ligatures w14:val="none"/>
+        </w:rPr>
+        <w:t xml:space="preserve">War-related instability </w:t>
+      </w:r>
+    </w:p>
+    <w:p>
+      <w:pPr>
         <w:numPr>
           <w:ilvl w:val="0"/>
           <w:numId w:val="1"/>
         </w:numPr>
-      </w:pPr>
-      <w:r>
-        <w:t xml:space="preserve"> The first we analysed is the </w:t>
-      </w:r>
-      <w:r>
-        <w:t>date</w:t>
-      </w:r>
-      <w:r>
-        <w:t xml:space="preserve"> processing removing of missing values and duplicates </w:t>
-      </w:r>
-    </w:p>
-    <w:p>
-      <w:pPr>
-        <w:pStyle w:val="ListParagraph"/>
+        <w:spacing w:before="100" w:beforeAutospacing="1" w:after="100" w:afterAutospacing="1" w:line="240" w:lineRule="auto"/>
+        <w:rPr>
+          <w:rFonts w:ascii="Times New Roman" w:eastAsia="Times New Roman" w:hAnsi="Times New Roman" w:cs="Times New Roman"/>
+          <w:kern w:val="0"/>
+          <w:lang w:eastAsia="en-IN"/>
+          <w14:ligatures w14:val="none"/>
+        </w:rPr>
+      </w:pPr>
+      <w:r>
+        <w:rPr>
+          <w:rFonts w:ascii="Times New Roman" w:eastAsia="Times New Roman" w:hAnsi="Times New Roman" w:cs="Times New Roman"/>
+          <w:kern w:val="0"/>
+          <w:lang w:eastAsia="en-IN"/>
+          <w14:ligatures w14:val="none"/>
+        </w:rPr>
+        <w:t xml:space="preserve">Supply chain interruptions </w:t>
+      </w:r>
+    </w:p>
+    <w:p>
+      <w:pPr>
         <w:numPr>
           <w:ilvl w:val="0"/>
           <w:numId w:val="1"/>
         </w:numPr>
-      </w:pPr>
-      <w:r>
-        <w:t xml:space="preserve"> Data </w:t>
-      </w:r>
-      <w:r>
-        <w:t>prepossessing</w:t>
-      </w:r>
-      <w:r>
-        <w:t xml:space="preserve"> – data missing values --- </w:t>
-      </w:r>
-      <w:r>
-        <w:t>maximum</w:t>
-      </w:r>
-      <w:r>
-        <w:t xml:space="preserve"> prices </w:t>
+        <w:spacing w:before="100" w:beforeAutospacing="1" w:after="100" w:afterAutospacing="1" w:line="240" w:lineRule="auto"/>
+        <w:rPr>
+          <w:rFonts w:ascii="Times New Roman" w:eastAsia="Times New Roman" w:hAnsi="Times New Roman" w:cs="Times New Roman"/>
+          <w:kern w:val="0"/>
+          <w:lang w:eastAsia="en-IN"/>
+          <w14:ligatures w14:val="none"/>
+        </w:rPr>
+      </w:pPr>
+      <w:r>
+        <w:rPr>
+          <w:rFonts w:ascii="Times New Roman" w:eastAsia="Times New Roman" w:hAnsi="Times New Roman" w:cs="Times New Roman"/>
+          <w:kern w:val="0"/>
+          <w:lang w:eastAsia="en-IN"/>
+          <w14:ligatures w14:val="none"/>
+        </w:rPr>
+        <w:t>Shortage of oil tankers and transportation constraints</w:t>
+      </w:r>
+    </w:p>
+    <w:p>
+      <w:pPr>
+        <w:pStyle w:val="ListParagraph"/>
+        <w:numPr>
+          <w:ilvl w:val="0"/>
+          <w:numId w:val="1"/>
+        </w:numPr>
+      </w:pPr>
+      <w:r>
+        <w:t xml:space="preserve"> The first we analysed is the date processing removing of missing values and duplicates </w:t>
+      </w:r>
+    </w:p>
+    <w:p>
+      <w:pPr>
+        <w:pStyle w:val="ListParagraph"/>
+        <w:numPr>
+          <w:ilvl w:val="0"/>
+          <w:numId w:val="1"/>
+        </w:numPr>
+      </w:pPr>
+      <w:r>
+        <w:t xml:space="preserve"> Data prepossessing – data missing values --- maximum prices </w:t>
       </w:r>
       <w:proofErr w:type="spellStart"/>
       <w:r>
         <w:t>Sq</w:t>
       </w:r>
+      <w:r>
+        <w:t>l</w:t>
+      </w:r>
       <w:proofErr w:type="spellEnd"/>
       <w:r>
-        <w:t>; query</w:t>
-      </w:r>
-    </w:p>
+        <w:t xml:space="preserve"> </w:t>
+      </w:r>
+      <w:r>
+        <w:t>query</w:t>
+      </w:r>
+    </w:p>
+    <w:p>
+      <w:pPr>
+        <w:rPr>
+          <w:b/>
+          <w:bCs/>
+        </w:rPr>
+      </w:pPr>
+      <w:r>
+        <w:rPr>
+          <w:b/>
+          <w:bCs/>
+        </w:rPr>
+        <w:t>Key Features (Variables)</w:t>
+      </w:r>
+    </w:p>
+    <w:p>
+      <w:r>
+        <w:t>The dataset includes the following types of variables:</w:t>
+      </w:r>
+    </w:p>
+    <w:p>
+      <w:pPr>
+        <w:numPr>
+          <w:ilvl w:val="0"/>
+          <w:numId w:val="3"/>
+        </w:numPr>
+      </w:pPr>
+      <w:r>
+        <w:rPr>
+          <w:b/>
+          <w:bCs/>
+        </w:rPr>
+        <w:t>Date</w:t>
+      </w:r>
+      <w:r>
+        <w:t xml:space="preserve">: Daily timestamp of recorded data </w:t>
+      </w:r>
+    </w:p>
+    <w:p>
+      <w:pPr>
+        <w:numPr>
+          <w:ilvl w:val="0"/>
+          <w:numId w:val="3"/>
+        </w:numPr>
+      </w:pPr>
+      <w:r>
+        <w:rPr>
+          <w:b/>
+          <w:bCs/>
+        </w:rPr>
+        <w:t>Country</w:t>
+      </w:r>
+      <w:r>
+        <w:t xml:space="preserve">: Region or country where sales are recorded </w:t>
+      </w:r>
+    </w:p>
+    <w:p>
+      <w:pPr>
+        <w:numPr>
+          <w:ilvl w:val="0"/>
+          <w:numId w:val="3"/>
+        </w:numPr>
+      </w:pPr>
+      <w:r>
+        <w:rPr>
+          <w:b/>
+          <w:bCs/>
+        </w:rPr>
+        <w:t>Crude Oil Barrel Price</w:t>
+      </w:r>
+      <w:r>
+        <w:t xml:space="preserve">: Price per barrel affected by war conditions </w:t>
+      </w:r>
+    </w:p>
+    <w:p>
+      <w:pPr>
+        <w:numPr>
+          <w:ilvl w:val="0"/>
+          <w:numId w:val="3"/>
+        </w:numPr>
+      </w:pPr>
+      <w:r>
+        <w:rPr>
+          <w:b/>
+          <w:bCs/>
+        </w:rPr>
+        <w:t>Sales Volume / Sales Price</w:t>
+      </w:r>
+      <w:r>
+        <w:t xml:space="preserve">: Daily oil sales performance </w:t>
+      </w:r>
+    </w:p>
+    <w:p>
+      <w:pPr>
+        <w:numPr>
+          <w:ilvl w:val="0"/>
+          <w:numId w:val="3"/>
+        </w:numPr>
+      </w:pPr>
+      <w:r>
+        <w:rPr>
+          <w:b/>
+          <w:bCs/>
+        </w:rPr>
+        <w:t>Supply Indicators</w:t>
+      </w:r>
+      <w:r>
+        <w:t xml:space="preserve">: Variables reflecting tanker shortages or supply disruptions </w:t>
+      </w:r>
+    </w:p>
+    <w:p>
+      <w:pPr>
+        <w:numPr>
+          <w:ilvl w:val="0"/>
+          <w:numId w:val="3"/>
+        </w:numPr>
+      </w:pPr>
+      <w:r>
+        <w:rPr>
+          <w:b/>
+          <w:bCs/>
+        </w:rPr>
+        <w:t>Derived Metrics</w:t>
+      </w:r>
+      <w:r>
+        <w:t>: Aggregated or calculated values such as maximum price trends</w:t>
+      </w:r>
+    </w:p>
+    <w:p>
+      <w:pPr>
+        <w:rPr>
+          <w:b/>
+          <w:bCs/>
+        </w:rPr>
+      </w:pPr>
+      <w:r>
+        <w:rPr>
+          <w:b/>
+          <w:bCs/>
+        </w:rPr>
+        <w:t>Data Understanding</w:t>
+      </w:r>
+    </w:p>
+    <w:p>
+      <w:r>
+        <w:t>Initial exploration of the dataset focused on:</w:t>
+      </w:r>
+    </w:p>
+    <w:p>
+      <w:pPr>
+        <w:numPr>
+          <w:ilvl w:val="0"/>
+          <w:numId w:val="4"/>
+        </w:numPr>
+      </w:pPr>
+      <w:r>
+        <w:t xml:space="preserve">Identifying </w:t>
+      </w:r>
+      <w:r>
+        <w:rPr>
+          <w:b/>
+          <w:bCs/>
+        </w:rPr>
+        <w:t>data structure and variable types</w:t>
+      </w:r>
+      <w:r>
+        <w:t xml:space="preserve"> </w:t>
+      </w:r>
+    </w:p>
+    <w:p>
+      <w:pPr>
+        <w:numPr>
+          <w:ilvl w:val="0"/>
+          <w:numId w:val="4"/>
+        </w:numPr>
+      </w:pPr>
+      <w:r>
+        <w:t xml:space="preserve">Understanding </w:t>
+      </w:r>
+      <w:r>
+        <w:rPr>
+          <w:b/>
+          <w:bCs/>
+        </w:rPr>
+        <w:t>price trends during conflict periods</w:t>
+      </w:r>
+      <w:r>
+        <w:t xml:space="preserve"> </w:t>
+      </w:r>
+    </w:p>
+    <w:p>
+      <w:pPr>
+        <w:numPr>
+          <w:ilvl w:val="0"/>
+          <w:numId w:val="4"/>
+        </w:numPr>
+      </w:pPr>
+      <w:r>
+        <w:t xml:space="preserve">Evaluating </w:t>
+      </w:r>
+      <w:r>
+        <w:rPr>
+          <w:b/>
+          <w:bCs/>
+        </w:rPr>
+        <w:t>country-</w:t>
+      </w:r>
+      <w:proofErr w:type="spellStart"/>
+      <w:r>
+        <w:rPr>
+          <w:b/>
+          <w:bCs/>
+        </w:rPr>
+        <w:t>wise</w:t>
+      </w:r>
+      <w:proofErr w:type="spellEnd"/>
+      <w:r>
+        <w:rPr>
+          <w:b/>
+          <w:bCs/>
+        </w:rPr>
+        <w:t xml:space="preserve"> variations in sales and pricing</w:t>
+      </w:r>
+    </w:p>
+    <w:p>
+      <w:pPr>
+        <w:rPr>
+          <w:b/>
+          <w:bCs/>
+        </w:rPr>
+      </w:pPr>
+      <w:r>
+        <w:rPr>
+          <w:b/>
+          <w:bCs/>
+        </w:rPr>
+        <w:lastRenderedPageBreak/>
+        <w:t>Data Preprocessing</w:t>
+      </w:r>
+    </w:p>
+    <w:p>
+      <w:r>
+        <w:t>To ensure data quality and reliability, the following preprocessing steps were performed:</w:t>
+      </w:r>
+    </w:p>
+    <w:p>
+      <w:pPr>
+        <w:numPr>
+          <w:ilvl w:val="0"/>
+          <w:numId w:val="5"/>
+        </w:numPr>
+      </w:pPr>
+      <w:r>
+        <w:rPr>
+          <w:b/>
+          <w:bCs/>
+        </w:rPr>
+        <w:t>Handling Missing Values</w:t>
+      </w:r>
+      <w:r>
+        <w:t xml:space="preserve"> </w:t>
+      </w:r>
+    </w:p>
+    <w:p>
+      <w:pPr>
+        <w:numPr>
+          <w:ilvl w:val="1"/>
+          <w:numId w:val="5"/>
+        </w:numPr>
+      </w:pPr>
+      <w:r>
+        <w:t xml:space="preserve">Missing entries were identified and treated using appropriate techniques (e.g., imputation or removal). </w:t>
+      </w:r>
+    </w:p>
+    <w:p>
+      <w:pPr>
+        <w:numPr>
+          <w:ilvl w:val="0"/>
+          <w:numId w:val="5"/>
+        </w:numPr>
+      </w:pPr>
+      <w:r>
+        <w:rPr>
+          <w:b/>
+          <w:bCs/>
+        </w:rPr>
+        <w:t>Removing Duplicates</w:t>
+      </w:r>
+      <w:r>
+        <w:t xml:space="preserve"> </w:t>
+      </w:r>
+    </w:p>
+    <w:p>
+      <w:pPr>
+        <w:numPr>
+          <w:ilvl w:val="1"/>
+          <w:numId w:val="5"/>
+        </w:numPr>
+      </w:pPr>
+      <w:r>
+        <w:t xml:space="preserve">Duplicate records were detected and eliminated to avoid bias in analysis. </w:t>
+      </w:r>
+    </w:p>
+    <w:p>
+      <w:pPr>
+        <w:numPr>
+          <w:ilvl w:val="0"/>
+          <w:numId w:val="5"/>
+        </w:numPr>
+      </w:pPr>
+      <w:r>
+        <w:rPr>
+          <w:b/>
+          <w:bCs/>
+        </w:rPr>
+        <w:t>Date Processing</w:t>
+      </w:r>
+      <w:r>
+        <w:t xml:space="preserve"> </w:t>
+      </w:r>
+    </w:p>
+    <w:p>
+      <w:pPr>
+        <w:numPr>
+          <w:ilvl w:val="1"/>
+          <w:numId w:val="5"/>
+        </w:numPr>
+      </w:pPr>
+      <w:r>
+        <w:t xml:space="preserve">Date fields were standardized and formatted for time-series analysis. </w:t>
+      </w:r>
+    </w:p>
+    <w:p>
+      <w:pPr>
+        <w:numPr>
+          <w:ilvl w:val="0"/>
+          <w:numId w:val="5"/>
+        </w:numPr>
+      </w:pPr>
+      <w:r>
+        <w:rPr>
+          <w:b/>
+          <w:bCs/>
+        </w:rPr>
+        <w:t>Outlier and Maximum Price Analysis</w:t>
+      </w:r>
+      <w:r>
+        <w:t xml:space="preserve"> </w:t>
+      </w:r>
+    </w:p>
+    <w:p>
+      <w:pPr>
+        <w:numPr>
+          <w:ilvl w:val="1"/>
+          <w:numId w:val="5"/>
+        </w:numPr>
+      </w:pPr>
+      <w:r>
+        <w:t xml:space="preserve">Extreme values, especially </w:t>
+      </w:r>
+      <w:r>
+        <w:rPr>
+          <w:b/>
+          <w:bCs/>
+        </w:rPr>
+        <w:t>maximum price spikes</w:t>
+      </w:r>
+      <w:r>
+        <w:t xml:space="preserve">, were examined to understand abnormal market </w:t>
+      </w:r>
+      <w:proofErr w:type="spellStart"/>
+      <w:r>
+        <w:t>behavior</w:t>
+      </w:r>
+      <w:proofErr w:type="spellEnd"/>
+      <w:r>
+        <w:t xml:space="preserve">. </w:t>
+      </w:r>
+    </w:p>
+    <w:p>
+      <w:pPr>
+        <w:numPr>
+          <w:ilvl w:val="0"/>
+          <w:numId w:val="5"/>
+        </w:numPr>
+      </w:pPr>
+      <w:r>
+        <w:rPr>
+          <w:b/>
+          <w:bCs/>
+        </w:rPr>
+        <w:t>Data Cleaning</w:t>
+      </w:r>
+      <w:r>
+        <w:t xml:space="preserve"> </w:t>
+      </w:r>
+    </w:p>
+    <w:p>
+      <w:pPr>
+        <w:numPr>
+          <w:ilvl w:val="1"/>
+          <w:numId w:val="5"/>
+        </w:numPr>
+      </w:pPr>
+      <w:r>
+        <w:t>Inconsistent or erroneous values were corrected to improve dataset integrity.</w:t>
+      </w:r>
+    </w:p>
+    <w:p>
+      <w:pPr>
+        <w:rPr>
+          <w:b/>
+          <w:bCs/>
+        </w:rPr>
+      </w:pPr>
+      <w:r>
+        <w:rPr>
+          <w:b/>
+          <w:bCs/>
+        </w:rPr>
+        <w:t>Purpose of the Dataset</w:t>
+      </w:r>
+    </w:p>
+    <w:p>
+      <w:r>
+        <w:t>The dataset is used to:</w:t>
+      </w:r>
+    </w:p>
+    <w:p>
+      <w:pPr>
+        <w:numPr>
+          <w:ilvl w:val="0"/>
+          <w:numId w:val="6"/>
+        </w:numPr>
+      </w:pPr>
+      <w:proofErr w:type="spellStart"/>
+      <w:r>
+        <w:t>Analyze</w:t>
+      </w:r>
+      <w:proofErr w:type="spellEnd"/>
+      <w:r>
+        <w:t xml:space="preserve"> how </w:t>
+      </w:r>
+      <w:r>
+        <w:rPr>
+          <w:b/>
+          <w:bCs/>
+        </w:rPr>
+        <w:t>geopolitical events impact oil prices and sales</w:t>
+      </w:r>
+      <w:r>
+        <w:t xml:space="preserve"> </w:t>
+      </w:r>
+    </w:p>
+    <w:p>
+      <w:pPr>
+        <w:numPr>
+          <w:ilvl w:val="0"/>
+          <w:numId w:val="6"/>
+        </w:numPr>
+      </w:pPr>
+      <w:r>
+        <w:t xml:space="preserve">Understand </w:t>
+      </w:r>
+      <w:r>
+        <w:rPr>
+          <w:b/>
+          <w:bCs/>
+        </w:rPr>
+        <w:t>country-</w:t>
+      </w:r>
+      <w:proofErr w:type="spellStart"/>
+      <w:r>
+        <w:rPr>
+          <w:b/>
+          <w:bCs/>
+        </w:rPr>
+        <w:t>wise</w:t>
+      </w:r>
+      <w:proofErr w:type="spellEnd"/>
+      <w:r>
+        <w:rPr>
+          <w:b/>
+          <w:bCs/>
+        </w:rPr>
+        <w:t xml:space="preserve"> variations in demand and pricing</w:t>
+      </w:r>
+      <w:r>
+        <w:t xml:space="preserve"> </w:t>
+      </w:r>
+    </w:p>
+    <w:p>
+      <w:pPr>
+        <w:numPr>
+          <w:ilvl w:val="0"/>
+          <w:numId w:val="6"/>
+        </w:numPr>
+      </w:pPr>
+      <w:r>
+        <w:t xml:space="preserve">Build predictive models to </w:t>
+      </w:r>
+      <w:r>
+        <w:rPr>
+          <w:b/>
+          <w:bCs/>
+        </w:rPr>
+        <w:t>forecast future sales prices</w:t>
+      </w:r>
+      <w:r>
+        <w:t xml:space="preserve"> based on: </w:t>
+      </w:r>
+    </w:p>
+    <w:p>
+      <w:pPr>
+        <w:numPr>
+          <w:ilvl w:val="1"/>
+          <w:numId w:val="6"/>
+        </w:numPr>
+      </w:pPr>
+      <w:r>
+        <w:t xml:space="preserve">Barrel price fluctuations </w:t>
+      </w:r>
+    </w:p>
+    <w:p>
+      <w:pPr>
+        <w:numPr>
+          <w:ilvl w:val="1"/>
+          <w:numId w:val="6"/>
+        </w:numPr>
+      </w:pPr>
+      <w:r>
+        <w:t xml:space="preserve">Supply chain disruptions </w:t>
+      </w:r>
+    </w:p>
+    <w:p>
+      <w:pPr>
+        <w:numPr>
+          <w:ilvl w:val="1"/>
+          <w:numId w:val="6"/>
+        </w:numPr>
+      </w:pPr>
+      <w:r>
+        <w:t>War-related constraints</w:t>
+      </w:r>
+    </w:p>
+    <w:p>
+      <w:pPr>
+        <w:rPr>
+          <w:b/>
+          <w:bCs/>
+        </w:rPr>
+      </w:pPr>
+      <w:r>
+        <w:rPr>
+          <w:b/>
+          <w:bCs/>
+        </w:rPr>
+        <w:t>Data Overview</w:t>
+      </w:r>
+    </w:p>
+    <w:p>
+      <w:pPr>
+        <w:numPr>
+          <w:ilvl w:val="0"/>
+          <w:numId w:val="7"/>
+        </w:numPr>
+      </w:pPr>
+      <w:r>
+        <w:t xml:space="preserve">The dataset contains daily records of oil prices and sales across multiple countries. </w:t>
+      </w:r>
+    </w:p>
+    <w:p>
+      <w:pPr>
+        <w:numPr>
+          <w:ilvl w:val="0"/>
+          <w:numId w:val="7"/>
+        </w:numPr>
+      </w:pPr>
+      <w:r>
+        <w:t xml:space="preserve">Initial inspection included: </w:t>
+      </w:r>
+    </w:p>
+    <w:p>
+      <w:pPr>
+        <w:numPr>
+          <w:ilvl w:val="1"/>
+          <w:numId w:val="7"/>
+        </w:numPr>
+      </w:pPr>
+      <w:r>
+        <w:t xml:space="preserve">Checking data types (numerical, categorical, date) </w:t>
+      </w:r>
+    </w:p>
+    <w:p>
+      <w:pPr>
+        <w:numPr>
+          <w:ilvl w:val="1"/>
+          <w:numId w:val="7"/>
+        </w:numPr>
+      </w:pPr>
+      <w:r>
+        <w:t xml:space="preserve">Understanding feature distributions </w:t>
+      </w:r>
+    </w:p>
+    <w:p>
+      <w:pPr>
+        <w:numPr>
+          <w:ilvl w:val="1"/>
+          <w:numId w:val="7"/>
+        </w:numPr>
+      </w:pPr>
+      <w:r>
+        <w:t xml:space="preserve">Identifying key variables influencing sales price </w:t>
+      </w:r>
+    </w:p>
+    <w:p/>
     <w:sectPr>
       <w:pgSz w:w="11906" w:h="16838"/>
       <w:pgMar w:top="1440" w:right="1440" w:bottom="1440" w:left="1440" w:header="708" w:footer="708" w:gutter="0"/>
@@ -181,6 +997,719 @@
 <file path=word/numbering.xml><?xml version="1.0" encoding="utf-8"?>
 <w:numbering xmlns:wpc="http://schemas.microsoft.com/office/word/2010/wordprocessingCanvas" xmlns:cx="http://schemas.microsoft.com/office/drawing/2014/chartex" xmlns:cx1="http://schemas.microsoft.com/office/drawing/2015/9/8/chartex" xmlns:cx2="http://schemas.microsoft.com/office/drawing/2015/10/21/chartex" xmlns:cx3="http://schemas.microsoft.com/office/drawing/2016/5/9/chartex" xmlns:cx4="http://schemas.microsoft.com/office/drawing/2016/5/10/chartex" xmlns:cx5="http://schemas.microsoft.com/office/drawing/2016/5/11/chartex" xmlns:cx6="http://schemas.microsoft.com/office/drawing/2016/5/12/chartex" xmlns:cx7="http://schemas.microsoft.com/office/drawing/2016/5/13/chartex" xmlns:cx8="http://schemas.microsoft.com/office/drawing/2016/5/14/chartex" xmlns:mc="http://schemas.openxmlformats.org/markup-compatibility/2006" xmlns:aink="http://schemas.microsoft.com/office/drawing/2016/ink" xmlns:am3d="http://schemas.microsoft.com/office/drawing/2017/model3d" xmlns:o="urn:schemas-microsoft-com:office:office" xmlns:oel="http://schemas.microsoft.com/office/2019/extlst" xmlns:r="http://schemas.openxmlformats.org/officeDocument/2006/relationships" xmlns:m="http://schemas.openxmlformats.org/officeDocument/2006/math" xmlns:v="urn:schemas-microsoft-com:vml" xmlns:wp14="http://schemas.microsoft.com/office/word/2010/wordprocessingDrawing" xmlns:wp="http://schemas.openxmlformats.org/drawingml/2006/wordprocessingDrawing" xmlns:w10="urn:schemas-microsoft-com:office:word" xmlns:w="http://schemas.openxmlformats.org/wordprocessingml/2006/main" xmlns:w14="http://schemas.microsoft.com/office/word/2010/wordml" xmlns:w15="http://schemas.microsoft.com/office/word/2012/wordml" xmlns:w16cex="http://schemas.microsoft.com/office/word/2018/wordml/cex" xmlns:w16cid="http://schemas.microsoft.com/office/word/2016/wordml/cid" xmlns:w16="http://schemas.microsoft.com/office/word/2018/wordml" xmlns:w16du="http://schemas.microsoft.com/office/word/2023/wordml/word16du" xmlns:w16sdtdh="http://schemas.microsoft.com/office/word/2020/wordml/sdtdatahash" xmlns:w16sdtfl="http://schemas.microsoft.com/office/word/2024/wordml/sdtformatlock" xmlns:w16se="http://schemas.microsoft.com/office/word/2015/wordml/symex" xmlns:wpg="http://schemas.microsoft.com/office/word/2010/wordprocessingGroup" xmlns:wpi="http://schemas.microsoft.com/office/word/2010/wordprocessingInk" xmlns:wne="http://schemas.microsoft.com/office/word/2006/wordml" xmlns:wps="http://schemas.microsoft.com/office/word/2010/wordprocessingShape" mc:Ignorable="w14 w15 w16se w16cid w16 w16cex w16sdtdh w16sdtfl w16du wp14">
   <w:abstractNum w:abstractNumId="0" w15:restartNumberingAfterBreak="0">
+    <w:nsid w:val="0C747B48"/>
+    <w:multiLevelType w:val="multilevel"/>
+    <w:tmpl w:val="9378E110"/>
+    <w:lvl w:ilvl="0">
+      <w:start w:val="1"/>
+      <w:numFmt w:val="bullet"/>
+      <w:lvlText w:val=""/>
+      <w:lvlJc w:val="left"/>
+      <w:pPr>
+        <w:tabs>
+          <w:tab w:val="num" w:pos="720"/>
+        </w:tabs>
+        <w:ind w:left="720" w:hanging="360"/>
+      </w:pPr>
+      <w:rPr>
+        <w:rFonts w:ascii="Symbol" w:hAnsi="Symbol" w:hint="default"/>
+        <w:sz w:val="20"/>
+      </w:rPr>
+    </w:lvl>
+    <w:lvl w:ilvl="1">
+      <w:start w:val="1"/>
+      <w:numFmt w:val="bullet"/>
+      <w:lvlText w:val="o"/>
+      <w:lvlJc w:val="left"/>
+      <w:pPr>
+        <w:tabs>
+          <w:tab w:val="num" w:pos="1440"/>
+        </w:tabs>
+        <w:ind w:left="1440" w:hanging="360"/>
+      </w:pPr>
+      <w:rPr>
+        <w:rFonts w:ascii="Courier New" w:hAnsi="Courier New" w:hint="default"/>
+        <w:sz w:val="20"/>
+      </w:rPr>
+    </w:lvl>
+    <w:lvl w:ilvl="2" w:tentative="1">
+      <w:start w:val="1"/>
+      <w:numFmt w:val="bullet"/>
+      <w:lvlText w:val=""/>
+      <w:lvlJc w:val="left"/>
+      <w:pPr>
+        <w:tabs>
+          <w:tab w:val="num" w:pos="2160"/>
+        </w:tabs>
+        <w:ind w:left="2160" w:hanging="360"/>
+      </w:pPr>
+      <w:rPr>
+        <w:rFonts w:ascii="Wingdings" w:hAnsi="Wingdings" w:hint="default"/>
+        <w:sz w:val="20"/>
+      </w:rPr>
+    </w:lvl>
+    <w:lvl w:ilvl="3" w:tentative="1">
+      <w:start w:val="1"/>
+      <w:numFmt w:val="bullet"/>
+      <w:lvlText w:val=""/>
+      <w:lvlJc w:val="left"/>
+      <w:pPr>
+        <w:tabs>
+          <w:tab w:val="num" w:pos="2880"/>
+        </w:tabs>
+        <w:ind w:left="2880" w:hanging="360"/>
+      </w:pPr>
+      <w:rPr>
+        <w:rFonts w:ascii="Wingdings" w:hAnsi="Wingdings" w:hint="default"/>
+        <w:sz w:val="20"/>
+      </w:rPr>
+    </w:lvl>
+    <w:lvl w:ilvl="4" w:tentative="1">
+      <w:start w:val="1"/>
+      <w:numFmt w:val="bullet"/>
+      <w:lvlText w:val=""/>
+      <w:lvlJc w:val="left"/>
+      <w:pPr>
+        <w:tabs>
+          <w:tab w:val="num" w:pos="3600"/>
+        </w:tabs>
+        <w:ind w:left="3600" w:hanging="360"/>
+      </w:pPr>
+      <w:rPr>
+        <w:rFonts w:ascii="Wingdings" w:hAnsi="Wingdings" w:hint="default"/>
+        <w:sz w:val="20"/>
+      </w:rPr>
+    </w:lvl>
+    <w:lvl w:ilvl="5" w:tentative="1">
+      <w:start w:val="1"/>
+      <w:numFmt w:val="bullet"/>
+      <w:lvlText w:val=""/>
+      <w:lvlJc w:val="left"/>
+      <w:pPr>
+        <w:tabs>
+          <w:tab w:val="num" w:pos="4320"/>
+        </w:tabs>
+        <w:ind w:left="4320" w:hanging="360"/>
+      </w:pPr>
+      <w:rPr>
+        <w:rFonts w:ascii="Wingdings" w:hAnsi="Wingdings" w:hint="default"/>
+        <w:sz w:val="20"/>
+      </w:rPr>
+    </w:lvl>
+    <w:lvl w:ilvl="6" w:tentative="1">
+      <w:start w:val="1"/>
+      <w:numFmt w:val="bullet"/>
+      <w:lvlText w:val=""/>
+      <w:lvlJc w:val="left"/>
+      <w:pPr>
+        <w:tabs>
+          <w:tab w:val="num" w:pos="5040"/>
+        </w:tabs>
+        <w:ind w:left="5040" w:hanging="360"/>
+      </w:pPr>
+      <w:rPr>
+        <w:rFonts w:ascii="Wingdings" w:hAnsi="Wingdings" w:hint="default"/>
+        <w:sz w:val="20"/>
+      </w:rPr>
+    </w:lvl>
+    <w:lvl w:ilvl="7" w:tentative="1">
+      <w:start w:val="1"/>
+      <w:numFmt w:val="bullet"/>
+      <w:lvlText w:val=""/>
+      <w:lvlJc w:val="left"/>
+      <w:pPr>
+        <w:tabs>
+          <w:tab w:val="num" w:pos="5760"/>
+        </w:tabs>
+        <w:ind w:left="5760" w:hanging="360"/>
+      </w:pPr>
+      <w:rPr>
+        <w:rFonts w:ascii="Wingdings" w:hAnsi="Wingdings" w:hint="default"/>
+        <w:sz w:val="20"/>
+      </w:rPr>
+    </w:lvl>
+    <w:lvl w:ilvl="8" w:tentative="1">
+      <w:start w:val="1"/>
+      <w:numFmt w:val="bullet"/>
+      <w:lvlText w:val=""/>
+      <w:lvlJc w:val="left"/>
+      <w:pPr>
+        <w:tabs>
+          <w:tab w:val="num" w:pos="6480"/>
+        </w:tabs>
+        <w:ind w:left="6480" w:hanging="360"/>
+      </w:pPr>
+      <w:rPr>
+        <w:rFonts w:ascii="Wingdings" w:hAnsi="Wingdings" w:hint="default"/>
+        <w:sz w:val="20"/>
+      </w:rPr>
+    </w:lvl>
+  </w:abstractNum>
+  <w:abstractNum w:abstractNumId="1" w15:restartNumberingAfterBreak="0">
+    <w:nsid w:val="10716E64"/>
+    <w:multiLevelType w:val="multilevel"/>
+    <w:tmpl w:val="A3687D2C"/>
+    <w:lvl w:ilvl="0">
+      <w:start w:val="1"/>
+      <w:numFmt w:val="bullet"/>
+      <w:lvlText w:val=""/>
+      <w:lvlJc w:val="left"/>
+      <w:pPr>
+        <w:tabs>
+          <w:tab w:val="num" w:pos="720"/>
+        </w:tabs>
+        <w:ind w:left="720" w:hanging="360"/>
+      </w:pPr>
+      <w:rPr>
+        <w:rFonts w:ascii="Symbol" w:hAnsi="Symbol" w:hint="default"/>
+        <w:sz w:val="20"/>
+      </w:rPr>
+    </w:lvl>
+    <w:lvl w:ilvl="1">
+      <w:start w:val="1"/>
+      <w:numFmt w:val="bullet"/>
+      <w:lvlText w:val="o"/>
+      <w:lvlJc w:val="left"/>
+      <w:pPr>
+        <w:tabs>
+          <w:tab w:val="num" w:pos="1440"/>
+        </w:tabs>
+        <w:ind w:left="1440" w:hanging="360"/>
+      </w:pPr>
+      <w:rPr>
+        <w:rFonts w:ascii="Courier New" w:hAnsi="Courier New" w:hint="default"/>
+        <w:sz w:val="20"/>
+      </w:rPr>
+    </w:lvl>
+    <w:lvl w:ilvl="2" w:tentative="1">
+      <w:start w:val="1"/>
+      <w:numFmt w:val="bullet"/>
+      <w:lvlText w:val=""/>
+      <w:lvlJc w:val="left"/>
+      <w:pPr>
+        <w:tabs>
+          <w:tab w:val="num" w:pos="2160"/>
+        </w:tabs>
+        <w:ind w:left="2160" w:hanging="360"/>
+      </w:pPr>
+      <w:rPr>
+        <w:rFonts w:ascii="Wingdings" w:hAnsi="Wingdings" w:hint="default"/>
+        <w:sz w:val="20"/>
+      </w:rPr>
+    </w:lvl>
+    <w:lvl w:ilvl="3" w:tentative="1">
+      <w:start w:val="1"/>
+      <w:numFmt w:val="bullet"/>
+      <w:lvlText w:val=""/>
+      <w:lvlJc w:val="left"/>
+      <w:pPr>
+        <w:tabs>
+          <w:tab w:val="num" w:pos="2880"/>
+        </w:tabs>
+        <w:ind w:left="2880" w:hanging="360"/>
+      </w:pPr>
+      <w:rPr>
+        <w:rFonts w:ascii="Wingdings" w:hAnsi="Wingdings" w:hint="default"/>
+        <w:sz w:val="20"/>
+      </w:rPr>
+    </w:lvl>
+    <w:lvl w:ilvl="4" w:tentative="1">
+      <w:start w:val="1"/>
+      <w:numFmt w:val="bullet"/>
+      <w:lvlText w:val=""/>
+      <w:lvlJc w:val="left"/>
+      <w:pPr>
+        <w:tabs>
+          <w:tab w:val="num" w:pos="3600"/>
+        </w:tabs>
+        <w:ind w:left="3600" w:hanging="360"/>
+      </w:pPr>
+      <w:rPr>
+        <w:rFonts w:ascii="Wingdings" w:hAnsi="Wingdings" w:hint="default"/>
+        <w:sz w:val="20"/>
+      </w:rPr>
+    </w:lvl>
+    <w:lvl w:ilvl="5" w:tentative="1">
+      <w:start w:val="1"/>
+      <w:numFmt w:val="bullet"/>
+      <w:lvlText w:val=""/>
+      <w:lvlJc w:val="left"/>
+      <w:pPr>
+        <w:tabs>
+          <w:tab w:val="num" w:pos="4320"/>
+        </w:tabs>
+        <w:ind w:left="4320" w:hanging="360"/>
+      </w:pPr>
+      <w:rPr>
+        <w:rFonts w:ascii="Wingdings" w:hAnsi="Wingdings" w:hint="default"/>
+        <w:sz w:val="20"/>
+      </w:rPr>
+    </w:lvl>
+    <w:lvl w:ilvl="6" w:tentative="1">
+      <w:start w:val="1"/>
+      <w:numFmt w:val="bullet"/>
+      <w:lvlText w:val=""/>
+      <w:lvlJc w:val="left"/>
+      <w:pPr>
+        <w:tabs>
+          <w:tab w:val="num" w:pos="5040"/>
+        </w:tabs>
+        <w:ind w:left="5040" w:hanging="360"/>
+      </w:pPr>
+      <w:rPr>
+        <w:rFonts w:ascii="Wingdings" w:hAnsi="Wingdings" w:hint="default"/>
+        <w:sz w:val="20"/>
+      </w:rPr>
+    </w:lvl>
+    <w:lvl w:ilvl="7" w:tentative="1">
+      <w:start w:val="1"/>
+      <w:numFmt w:val="bullet"/>
+      <w:lvlText w:val=""/>
+      <w:lvlJc w:val="left"/>
+      <w:pPr>
+        <w:tabs>
+          <w:tab w:val="num" w:pos="5760"/>
+        </w:tabs>
+        <w:ind w:left="5760" w:hanging="360"/>
+      </w:pPr>
+      <w:rPr>
+        <w:rFonts w:ascii="Wingdings" w:hAnsi="Wingdings" w:hint="default"/>
+        <w:sz w:val="20"/>
+      </w:rPr>
+    </w:lvl>
+    <w:lvl w:ilvl="8" w:tentative="1">
+      <w:start w:val="1"/>
+      <w:numFmt w:val="bullet"/>
+      <w:lvlText w:val=""/>
+      <w:lvlJc w:val="left"/>
+      <w:pPr>
+        <w:tabs>
+          <w:tab w:val="num" w:pos="6480"/>
+        </w:tabs>
+        <w:ind w:left="6480" w:hanging="360"/>
+      </w:pPr>
+      <w:rPr>
+        <w:rFonts w:ascii="Wingdings" w:hAnsi="Wingdings" w:hint="default"/>
+        <w:sz w:val="20"/>
+      </w:rPr>
+    </w:lvl>
+  </w:abstractNum>
+  <w:abstractNum w:abstractNumId="2" w15:restartNumberingAfterBreak="0">
+    <w:nsid w:val="134313C0"/>
+    <w:multiLevelType w:val="multilevel"/>
+    <w:tmpl w:val="D5164E76"/>
+    <w:lvl w:ilvl="0">
+      <w:start w:val="1"/>
+      <w:numFmt w:val="bullet"/>
+      <w:lvlText w:val=""/>
+      <w:lvlJc w:val="left"/>
+      <w:pPr>
+        <w:tabs>
+          <w:tab w:val="num" w:pos="720"/>
+        </w:tabs>
+        <w:ind w:left="720" w:hanging="360"/>
+      </w:pPr>
+      <w:rPr>
+        <w:rFonts w:ascii="Symbol" w:hAnsi="Symbol" w:hint="default"/>
+        <w:sz w:val="20"/>
+      </w:rPr>
+    </w:lvl>
+    <w:lvl w:ilvl="1" w:tentative="1">
+      <w:start w:val="1"/>
+      <w:numFmt w:val="bullet"/>
+      <w:lvlText w:val="o"/>
+      <w:lvlJc w:val="left"/>
+      <w:pPr>
+        <w:tabs>
+          <w:tab w:val="num" w:pos="1440"/>
+        </w:tabs>
+        <w:ind w:left="1440" w:hanging="360"/>
+      </w:pPr>
+      <w:rPr>
+        <w:rFonts w:ascii="Courier New" w:hAnsi="Courier New" w:hint="default"/>
+        <w:sz w:val="20"/>
+      </w:rPr>
+    </w:lvl>
+    <w:lvl w:ilvl="2" w:tentative="1">
+      <w:start w:val="1"/>
+      <w:numFmt w:val="bullet"/>
+      <w:lvlText w:val=""/>
+      <w:lvlJc w:val="left"/>
+      <w:pPr>
+        <w:tabs>
+          <w:tab w:val="num" w:pos="2160"/>
+        </w:tabs>
+        <w:ind w:left="2160" w:hanging="360"/>
+      </w:pPr>
+      <w:rPr>
+        <w:rFonts w:ascii="Wingdings" w:hAnsi="Wingdings" w:hint="default"/>
+        <w:sz w:val="20"/>
+      </w:rPr>
+    </w:lvl>
+    <w:lvl w:ilvl="3" w:tentative="1">
+      <w:start w:val="1"/>
+      <w:numFmt w:val="bullet"/>
+      <w:lvlText w:val=""/>
+      <w:lvlJc w:val="left"/>
+      <w:pPr>
+        <w:tabs>
+          <w:tab w:val="num" w:pos="2880"/>
+        </w:tabs>
+        <w:ind w:left="2880" w:hanging="360"/>
+      </w:pPr>
+      <w:rPr>
+        <w:rFonts w:ascii="Wingdings" w:hAnsi="Wingdings" w:hint="default"/>
+        <w:sz w:val="20"/>
+      </w:rPr>
+    </w:lvl>
+    <w:lvl w:ilvl="4" w:tentative="1">
+      <w:start w:val="1"/>
+      <w:numFmt w:val="bullet"/>
+      <w:lvlText w:val=""/>
+      <w:lvlJc w:val="left"/>
+      <w:pPr>
+        <w:tabs>
+          <w:tab w:val="num" w:pos="3600"/>
+        </w:tabs>
+        <w:ind w:left="3600" w:hanging="360"/>
+      </w:pPr>
+      <w:rPr>
+        <w:rFonts w:ascii="Wingdings" w:hAnsi="Wingdings" w:hint="default"/>
+        <w:sz w:val="20"/>
+      </w:rPr>
+    </w:lvl>
+    <w:lvl w:ilvl="5" w:tentative="1">
+      <w:start w:val="1"/>
+      <w:numFmt w:val="bullet"/>
+      <w:lvlText w:val=""/>
+      <w:lvlJc w:val="left"/>
+      <w:pPr>
+        <w:tabs>
+          <w:tab w:val="num" w:pos="4320"/>
+        </w:tabs>
+        <w:ind w:left="4320" w:hanging="360"/>
+      </w:pPr>
+      <w:rPr>
+        <w:rFonts w:ascii="Wingdings" w:hAnsi="Wingdings" w:hint="default"/>
+        <w:sz w:val="20"/>
+      </w:rPr>
+    </w:lvl>
+    <w:lvl w:ilvl="6" w:tentative="1">
+      <w:start w:val="1"/>
+      <w:numFmt w:val="bullet"/>
+      <w:lvlText w:val=""/>
+      <w:lvlJc w:val="left"/>
+      <w:pPr>
+        <w:tabs>
+          <w:tab w:val="num" w:pos="5040"/>
+        </w:tabs>
+        <w:ind w:left="5040" w:hanging="360"/>
+      </w:pPr>
+      <w:rPr>
+        <w:rFonts w:ascii="Wingdings" w:hAnsi="Wingdings" w:hint="default"/>
+        <w:sz w:val="20"/>
+      </w:rPr>
+    </w:lvl>
+    <w:lvl w:ilvl="7" w:tentative="1">
+      <w:start w:val="1"/>
+      <w:numFmt w:val="bullet"/>
+      <w:lvlText w:val=""/>
+      <w:lvlJc w:val="left"/>
+      <w:pPr>
+        <w:tabs>
+          <w:tab w:val="num" w:pos="5760"/>
+        </w:tabs>
+        <w:ind w:left="5760" w:hanging="360"/>
+      </w:pPr>
+      <w:rPr>
+        <w:rFonts w:ascii="Wingdings" w:hAnsi="Wingdings" w:hint="default"/>
+        <w:sz w:val="20"/>
+      </w:rPr>
+    </w:lvl>
+    <w:lvl w:ilvl="8" w:tentative="1">
+      <w:start w:val="1"/>
+      <w:numFmt w:val="bullet"/>
+      <w:lvlText w:val=""/>
+      <w:lvlJc w:val="left"/>
+      <w:pPr>
+        <w:tabs>
+          <w:tab w:val="num" w:pos="6480"/>
+        </w:tabs>
+        <w:ind w:left="6480" w:hanging="360"/>
+      </w:pPr>
+      <w:rPr>
+        <w:rFonts w:ascii="Wingdings" w:hAnsi="Wingdings" w:hint="default"/>
+        <w:sz w:val="20"/>
+      </w:rPr>
+    </w:lvl>
+  </w:abstractNum>
+  <w:abstractNum w:abstractNumId="3" w15:restartNumberingAfterBreak="0">
+    <w:nsid w:val="273712B5"/>
+    <w:multiLevelType w:val="multilevel"/>
+    <w:tmpl w:val="C8B08180"/>
+    <w:lvl w:ilvl="0">
+      <w:start w:val="1"/>
+      <w:numFmt w:val="decimal"/>
+      <w:lvlText w:val="%1."/>
+      <w:lvlJc w:val="left"/>
+      <w:pPr>
+        <w:tabs>
+          <w:tab w:val="num" w:pos="720"/>
+        </w:tabs>
+        <w:ind w:left="720" w:hanging="360"/>
+      </w:pPr>
+    </w:lvl>
+    <w:lvl w:ilvl="1">
+      <w:start w:val="1"/>
+      <w:numFmt w:val="bullet"/>
+      <w:lvlText w:val="o"/>
+      <w:lvlJc w:val="left"/>
+      <w:pPr>
+        <w:tabs>
+          <w:tab w:val="num" w:pos="1440"/>
+        </w:tabs>
+        <w:ind w:left="1440" w:hanging="360"/>
+      </w:pPr>
+      <w:rPr>
+        <w:rFonts w:ascii="Courier New" w:hAnsi="Courier New" w:hint="default"/>
+        <w:sz w:val="20"/>
+      </w:rPr>
+    </w:lvl>
+    <w:lvl w:ilvl="2" w:tentative="1">
+      <w:start w:val="1"/>
+      <w:numFmt w:val="decimal"/>
+      <w:lvlText w:val="%3."/>
+      <w:lvlJc w:val="left"/>
+      <w:pPr>
+        <w:tabs>
+          <w:tab w:val="num" w:pos="2160"/>
+        </w:tabs>
+        <w:ind w:left="2160" w:hanging="360"/>
+      </w:pPr>
+    </w:lvl>
+    <w:lvl w:ilvl="3" w:tentative="1">
+      <w:start w:val="1"/>
+      <w:numFmt w:val="decimal"/>
+      <w:lvlText w:val="%4."/>
+      <w:lvlJc w:val="left"/>
+      <w:pPr>
+        <w:tabs>
+          <w:tab w:val="num" w:pos="2880"/>
+        </w:tabs>
+        <w:ind w:left="2880" w:hanging="360"/>
+      </w:pPr>
+    </w:lvl>
+    <w:lvl w:ilvl="4" w:tentative="1">
+      <w:start w:val="1"/>
+      <w:numFmt w:val="decimal"/>
+      <w:lvlText w:val="%5."/>
+      <w:lvlJc w:val="left"/>
+      <w:pPr>
+        <w:tabs>
+          <w:tab w:val="num" w:pos="3600"/>
+        </w:tabs>
+        <w:ind w:left="3600" w:hanging="360"/>
+      </w:pPr>
+    </w:lvl>
+    <w:lvl w:ilvl="5" w:tentative="1">
+      <w:start w:val="1"/>
+      <w:numFmt w:val="decimal"/>
+      <w:lvlText w:val="%6."/>
+      <w:lvlJc w:val="left"/>
+      <w:pPr>
+        <w:tabs>
+          <w:tab w:val="num" w:pos="4320"/>
+        </w:tabs>
+        <w:ind w:left="4320" w:hanging="360"/>
+      </w:pPr>
+    </w:lvl>
+    <w:lvl w:ilvl="6" w:tentative="1">
+      <w:start w:val="1"/>
+      <w:numFmt w:val="decimal"/>
+      <w:lvlText w:val="%7."/>
+      <w:lvlJc w:val="left"/>
+      <w:pPr>
+        <w:tabs>
+          <w:tab w:val="num" w:pos="5040"/>
+        </w:tabs>
+        <w:ind w:left="5040" w:hanging="360"/>
+      </w:pPr>
+    </w:lvl>
+    <w:lvl w:ilvl="7" w:tentative="1">
+      <w:start w:val="1"/>
+      <w:numFmt w:val="decimal"/>
+      <w:lvlText w:val="%8."/>
+      <w:lvlJc w:val="left"/>
+      <w:pPr>
+        <w:tabs>
+          <w:tab w:val="num" w:pos="5760"/>
+        </w:tabs>
+        <w:ind w:left="5760" w:hanging="360"/>
+      </w:pPr>
+    </w:lvl>
+    <w:lvl w:ilvl="8" w:tentative="1">
+      <w:start w:val="1"/>
+      <w:numFmt w:val="decimal"/>
+      <w:lvlText w:val="%9."/>
+      <w:lvlJc w:val="left"/>
+      <w:pPr>
+        <w:tabs>
+          <w:tab w:val="num" w:pos="6480"/>
+        </w:tabs>
+        <w:ind w:left="6480" w:hanging="360"/>
+      </w:pPr>
+    </w:lvl>
+  </w:abstractNum>
+  <w:abstractNum w:abstractNumId="4" w15:restartNumberingAfterBreak="0">
+    <w:nsid w:val="3B8D574E"/>
+    <w:multiLevelType w:val="multilevel"/>
+    <w:tmpl w:val="34E47CA8"/>
+    <w:lvl w:ilvl="0">
+      <w:start w:val="1"/>
+      <w:numFmt w:val="bullet"/>
+      <w:lvlText w:val=""/>
+      <w:lvlJc w:val="left"/>
+      <w:pPr>
+        <w:tabs>
+          <w:tab w:val="num" w:pos="720"/>
+        </w:tabs>
+        <w:ind w:left="720" w:hanging="360"/>
+      </w:pPr>
+      <w:rPr>
+        <w:rFonts w:ascii="Symbol" w:hAnsi="Symbol" w:hint="default"/>
+        <w:sz w:val="20"/>
+      </w:rPr>
+    </w:lvl>
+    <w:lvl w:ilvl="1" w:tentative="1">
+      <w:start w:val="1"/>
+      <w:numFmt w:val="bullet"/>
+      <w:lvlText w:val="o"/>
+      <w:lvlJc w:val="left"/>
+      <w:pPr>
+        <w:tabs>
+          <w:tab w:val="num" w:pos="1440"/>
+        </w:tabs>
+        <w:ind w:left="1440" w:hanging="360"/>
+      </w:pPr>
+      <w:rPr>
+        <w:rFonts w:ascii="Courier New" w:hAnsi="Courier New" w:hint="default"/>
+        <w:sz w:val="20"/>
+      </w:rPr>
+    </w:lvl>
+    <w:lvl w:ilvl="2" w:tentative="1">
+      <w:start w:val="1"/>
+      <w:numFmt w:val="bullet"/>
+      <w:lvlText w:val=""/>
+      <w:lvlJc w:val="left"/>
+      <w:pPr>
+        <w:tabs>
+          <w:tab w:val="num" w:pos="2160"/>
+        </w:tabs>
+        <w:ind w:left="2160" w:hanging="360"/>
+      </w:pPr>
+      <w:rPr>
+        <w:rFonts w:ascii="Wingdings" w:hAnsi="Wingdings" w:hint="default"/>
+        <w:sz w:val="20"/>
+      </w:rPr>
+    </w:lvl>
+    <w:lvl w:ilvl="3" w:tentative="1">
+      <w:start w:val="1"/>
+      <w:numFmt w:val="bullet"/>
+      <w:lvlText w:val=""/>
+      <w:lvlJc w:val="left"/>
+      <w:pPr>
+        <w:tabs>
+          <w:tab w:val="num" w:pos="2880"/>
+        </w:tabs>
+        <w:ind w:left="2880" w:hanging="360"/>
+      </w:pPr>
+      <w:rPr>
+        <w:rFonts w:ascii="Wingdings" w:hAnsi="Wingdings" w:hint="default"/>
+        <w:sz w:val="20"/>
+      </w:rPr>
+    </w:lvl>
+    <w:lvl w:ilvl="4" w:tentative="1">
+      <w:start w:val="1"/>
+      <w:numFmt w:val="bullet"/>
+      <w:lvlText w:val=""/>
+      <w:lvlJc w:val="left"/>
+      <w:pPr>
+        <w:tabs>
+          <w:tab w:val="num" w:pos="3600"/>
+        </w:tabs>
+        <w:ind w:left="3600" w:hanging="360"/>
+      </w:pPr>
+      <w:rPr>
+        <w:rFonts w:ascii="Wingdings" w:hAnsi="Wingdings" w:hint="default"/>
+        <w:sz w:val="20"/>
+      </w:rPr>
+    </w:lvl>
+    <w:lvl w:ilvl="5" w:tentative="1">
+      <w:start w:val="1"/>
+      <w:numFmt w:val="bullet"/>
+      <w:lvlText w:val=""/>
+      <w:lvlJc w:val="left"/>
+      <w:pPr>
+        <w:tabs>
+          <w:tab w:val="num" w:pos="4320"/>
+        </w:tabs>
+        <w:ind w:left="4320" w:hanging="360"/>
+      </w:pPr>
+      <w:rPr>
+        <w:rFonts w:ascii="Wingdings" w:hAnsi="Wingdings" w:hint="default"/>
+        <w:sz w:val="20"/>
+      </w:rPr>
+    </w:lvl>
+    <w:lvl w:ilvl="6" w:tentative="1">
+      <w:start w:val="1"/>
+      <w:numFmt w:val="bullet"/>
+      <w:lvlText w:val=""/>
+      <w:lvlJc w:val="left"/>
+      <w:pPr>
+        <w:tabs>
+          <w:tab w:val="num" w:pos="5040"/>
+        </w:tabs>
+        <w:ind w:left="5040" w:hanging="360"/>
+      </w:pPr>
+      <w:rPr>
+        <w:rFonts w:ascii="Wingdings" w:hAnsi="Wingdings" w:hint="default"/>
+        <w:sz w:val="20"/>
+      </w:rPr>
+    </w:lvl>
+    <w:lvl w:ilvl="7" w:tentative="1">
+      <w:start w:val="1"/>
+      <w:numFmt w:val="bullet"/>
+      <w:lvlText w:val=""/>
+      <w:lvlJc w:val="left"/>
+      <w:pPr>
+        <w:tabs>
+          <w:tab w:val="num" w:pos="5760"/>
+        </w:tabs>
+        <w:ind w:left="5760" w:hanging="360"/>
+      </w:pPr>
+      <w:rPr>
+        <w:rFonts w:ascii="Wingdings" w:hAnsi="Wingdings" w:hint="default"/>
+        <w:sz w:val="20"/>
+      </w:rPr>
+    </w:lvl>
+    <w:lvl w:ilvl="8" w:tentative="1">
+      <w:start w:val="1"/>
+      <w:numFmt w:val="bullet"/>
+      <w:lvlText w:val=""/>
+      <w:lvlJc w:val="left"/>
+      <w:pPr>
+        <w:tabs>
+          <w:tab w:val="num" w:pos="6480"/>
+        </w:tabs>
+        <w:ind w:left="6480" w:hanging="360"/>
+      </w:pPr>
+      <w:rPr>
+        <w:rFonts w:ascii="Wingdings" w:hAnsi="Wingdings" w:hint="default"/>
+        <w:sz w:val="20"/>
+      </w:rPr>
+    </w:lvl>
+  </w:abstractNum>
+  <w:abstractNum w:abstractNumId="5" w15:restartNumberingAfterBreak="0">
     <w:nsid w:val="46F972F2"/>
     <w:multiLevelType w:val="hybridMultilevel"/>
     <w:tmpl w:val="0E9A6500"/>
@@ -269,7 +1798,174 @@
       </w:pPr>
     </w:lvl>
   </w:abstractNum>
+  <w:abstractNum w:abstractNumId="6" w15:restartNumberingAfterBreak="0">
+    <w:nsid w:val="7F2909EE"/>
+    <w:multiLevelType w:val="multilevel"/>
+    <w:tmpl w:val="280C9DC8"/>
+    <w:lvl w:ilvl="0">
+      <w:start w:val="1"/>
+      <w:numFmt w:val="bullet"/>
+      <w:lvlText w:val=""/>
+      <w:lvlJc w:val="left"/>
+      <w:pPr>
+        <w:tabs>
+          <w:tab w:val="num" w:pos="720"/>
+        </w:tabs>
+        <w:ind w:left="720" w:hanging="360"/>
+      </w:pPr>
+      <w:rPr>
+        <w:rFonts w:ascii="Symbol" w:hAnsi="Symbol" w:hint="default"/>
+        <w:sz w:val="20"/>
+      </w:rPr>
+    </w:lvl>
+    <w:lvl w:ilvl="1" w:tentative="1">
+      <w:start w:val="1"/>
+      <w:numFmt w:val="bullet"/>
+      <w:lvlText w:val="o"/>
+      <w:lvlJc w:val="left"/>
+      <w:pPr>
+        <w:tabs>
+          <w:tab w:val="num" w:pos="1440"/>
+        </w:tabs>
+        <w:ind w:left="1440" w:hanging="360"/>
+      </w:pPr>
+      <w:rPr>
+        <w:rFonts w:ascii="Courier New" w:hAnsi="Courier New" w:hint="default"/>
+        <w:sz w:val="20"/>
+      </w:rPr>
+    </w:lvl>
+    <w:lvl w:ilvl="2" w:tentative="1">
+      <w:start w:val="1"/>
+      <w:numFmt w:val="bullet"/>
+      <w:lvlText w:val=""/>
+      <w:lvlJc w:val="left"/>
+      <w:pPr>
+        <w:tabs>
+          <w:tab w:val="num" w:pos="2160"/>
+        </w:tabs>
+        <w:ind w:left="2160" w:hanging="360"/>
+      </w:pPr>
+      <w:rPr>
+        <w:rFonts w:ascii="Wingdings" w:hAnsi="Wingdings" w:hint="default"/>
+        <w:sz w:val="20"/>
+      </w:rPr>
+    </w:lvl>
+    <w:lvl w:ilvl="3" w:tentative="1">
+      <w:start w:val="1"/>
+      <w:numFmt w:val="bullet"/>
+      <w:lvlText w:val=""/>
+      <w:lvlJc w:val="left"/>
+      <w:pPr>
+        <w:tabs>
+          <w:tab w:val="num" w:pos="2880"/>
+        </w:tabs>
+        <w:ind w:left="2880" w:hanging="360"/>
+      </w:pPr>
+      <w:rPr>
+        <w:rFonts w:ascii="Wingdings" w:hAnsi="Wingdings" w:hint="default"/>
+        <w:sz w:val="20"/>
+      </w:rPr>
+    </w:lvl>
+    <w:lvl w:ilvl="4" w:tentative="1">
+      <w:start w:val="1"/>
+      <w:numFmt w:val="bullet"/>
+      <w:lvlText w:val=""/>
+      <w:lvlJc w:val="left"/>
+      <w:pPr>
+        <w:tabs>
+          <w:tab w:val="num" w:pos="3600"/>
+        </w:tabs>
+        <w:ind w:left="3600" w:hanging="360"/>
+      </w:pPr>
+      <w:rPr>
+        <w:rFonts w:ascii="Wingdings" w:hAnsi="Wingdings" w:hint="default"/>
+        <w:sz w:val="20"/>
+      </w:rPr>
+    </w:lvl>
+    <w:lvl w:ilvl="5" w:tentative="1">
+      <w:start w:val="1"/>
+      <w:numFmt w:val="bullet"/>
+      <w:lvlText w:val=""/>
+      <w:lvlJc w:val="left"/>
+      <w:pPr>
+        <w:tabs>
+          <w:tab w:val="num" w:pos="4320"/>
+        </w:tabs>
+        <w:ind w:left="4320" w:hanging="360"/>
+      </w:pPr>
+      <w:rPr>
+        <w:rFonts w:ascii="Wingdings" w:hAnsi="Wingdings" w:hint="default"/>
+        <w:sz w:val="20"/>
+      </w:rPr>
+    </w:lvl>
+    <w:lvl w:ilvl="6" w:tentative="1">
+      <w:start w:val="1"/>
+      <w:numFmt w:val="bullet"/>
+      <w:lvlText w:val=""/>
+      <w:lvlJc w:val="left"/>
+      <w:pPr>
+        <w:tabs>
+          <w:tab w:val="num" w:pos="5040"/>
+        </w:tabs>
+        <w:ind w:left="5040" w:hanging="360"/>
+      </w:pPr>
+      <w:rPr>
+        <w:rFonts w:ascii="Wingdings" w:hAnsi="Wingdings" w:hint="default"/>
+        <w:sz w:val="20"/>
+      </w:rPr>
+    </w:lvl>
+    <w:lvl w:ilvl="7" w:tentative="1">
+      <w:start w:val="1"/>
+      <w:numFmt w:val="bullet"/>
+      <w:lvlText w:val=""/>
+      <w:lvlJc w:val="left"/>
+      <w:pPr>
+        <w:tabs>
+          <w:tab w:val="num" w:pos="5760"/>
+        </w:tabs>
+        <w:ind w:left="5760" w:hanging="360"/>
+      </w:pPr>
+      <w:rPr>
+        <w:rFonts w:ascii="Wingdings" w:hAnsi="Wingdings" w:hint="default"/>
+        <w:sz w:val="20"/>
+      </w:rPr>
+    </w:lvl>
+    <w:lvl w:ilvl="8" w:tentative="1">
+      <w:start w:val="1"/>
+      <w:numFmt w:val="bullet"/>
+      <w:lvlText w:val=""/>
+      <w:lvlJc w:val="left"/>
+      <w:pPr>
+        <w:tabs>
+          <w:tab w:val="num" w:pos="6480"/>
+        </w:tabs>
+        <w:ind w:left="6480" w:hanging="360"/>
+      </w:pPr>
+      <w:rPr>
+        <w:rFonts w:ascii="Wingdings" w:hAnsi="Wingdings" w:hint="default"/>
+        <w:sz w:val="20"/>
+      </w:rPr>
+    </w:lvl>
+  </w:abstractNum>
   <w:num w:numId="1" w16cid:durableId="29688971">
+    <w:abstractNumId w:val="5"/>
+  </w:num>
+  <w:num w:numId="2" w16cid:durableId="1355501365">
+    <w:abstractNumId w:val="6"/>
+  </w:num>
+  <w:num w:numId="3" w16cid:durableId="1588417146">
+    <w:abstractNumId w:val="4"/>
+  </w:num>
+  <w:num w:numId="4" w16cid:durableId="781218661">
+    <w:abstractNumId w:val="2"/>
+  </w:num>
+  <w:num w:numId="5" w16cid:durableId="1376587399">
+    <w:abstractNumId w:val="3"/>
+  </w:num>
+  <w:num w:numId="6" w16cid:durableId="1413240982">
+    <w:abstractNumId w:val="1"/>
+  </w:num>
+  <w:num w:numId="7" w16cid:durableId="1902017601">
     <w:abstractNumId w:val="0"/>
   </w:num>
 </w:numbering>
@@ -1191,6 +2887,28 @@
       <w:spacing w:val="5"/>
     </w:rPr>
   </w:style>
+  <w:style w:type="character" w:styleId="Strong">
+    <w:name w:val="Strong"/>
+    <w:basedOn w:val="DefaultParagraphFont"/>
+    <w:uiPriority w:val="22"/>
+    <w:qFormat/>
+    <w:rsid w:val="007A208C"/>
+    <w:rPr>
+      <w:b/>
+      <w:bCs/>
+    </w:rPr>
+  </w:style>
+  <w:style w:type="character" w:styleId="Emphasis">
+    <w:name w:val="Emphasis"/>
+    <w:basedOn w:val="DefaultParagraphFont"/>
+    <w:uiPriority w:val="20"/>
+    <w:qFormat/>
+    <w:rsid w:val="007A208C"/>
+    <w:rPr>
+      <w:i/>
+      <w:iCs/>
+    </w:rPr>
+  </w:style>
 </w:styles>
 </file>
 

</xml_diff>